<commit_message>
docs: verify Hyperscience runbook and clarify trainer storage and GPU requirements
</commit_message>
<xml_diff>
--- a/Hyperscience_OCI_POC_Infrastructure_Build_Runbook.docx
+++ b/Hyperscience_OCI_POC_Infrastructure_Build_Runbook.docx
@@ -683,12 +683,12 @@
     </w:p>
     <w:p>
       <w:r>
-        <w:t>Create the application VM with the approved RHEL 8.10 x86_64 image and VM.GPU.A10.2 shape. Keep its two A10 GPUs distinct. Provision the separate trainer after Chase confirms the CPU/GPU requirement; do not colocate it for this baseline. Record image, shape, OCIDs, private IPs, disk sizes and owner in the handoff.</w:t>
+        <w:t>Create the application VM with the approved RHEL 8.10 x86_64 image and VM.GPU.A10.2 shape. Keep its two A10 GPUs distinct. For semi-structured training, plan a separate Intel x86_64 trainer with at least 16 vCPUs and 64 GB RAM, subject to Chase confirming release/workload sizing and GPU needs. Do not colocate it. Record image, shape, OCIDs, private IPs, disks and owner. [2]</w:t>
       </w:r>
     </w:p>
     <w:p>
       <w:r>
-        <w:t>Attach persistent block storage and mount by UUID. The earlier 100 GB boot + 600 GB data estimate is provisional: verify actual free space at the bundle path, rootful Podman graphRoot, database and media paths. Meet the selected release’s 400 GB base requirement, plus ORCA’s additional 100 GB when used, plus test data and growth. A large unmounted disk does not meet this gate. [2,3]</w:t>
+        <w:t>Attach persistent block storage and mount by UUID. The earlier 100 GB boot + 600 GB data estimate is provisional. On each VM allocate at least 300 GB for bundle download/extraction and 100 GB for rootful Podman images, excluding OS space; add DB/media growth. For ORCA add 100 GB beyond this base. Verify actual capacity at each path, including graphRoot; a disk mounted elsewhere does not satisfy the requirement. [2,3]</w:t>
       </w:r>
     </w:p>
     <w:p>
@@ -1190,7 +1190,7 @@
     </w:p>
     <w:p>
       <w:r>
-        <w:t>Create /opt/hs and the chosen persistent data directory. Download once through the approved channel and distribute internally. Compare SHA-256 before and after each transfer, then extract the exact approved archive in /opt/hs. Use the resulting bundle directory for subsequent commands. Resolve any mismatch before extraction. [8]</w:t>
+        <w:t>Create /opt/hs and the chosen persistent data directory. Download once through the approved channel. Match its SHA-256 to the vendor-provided checksum, then verify the same hash after every internal transfer. Extract the approved archive in /opt/hs and use its resulting directory for later commands. Resolve any mismatch before extraction. [8]</w:t>
       </w:r>
     </w:p>
     <w:p>
@@ -1314,7 +1314,7 @@
     </w:p>
     <w:p>
       <w:r>
-        <w:t>Use an approved sample to demonstrate actual model execution and GPU utilization. Record model/version, processing outcome and GPU metrics. Omit this step when ORCA is not in scope, and document what alternative GPU workload is being tested. [7]</w:t>
+        <w:t>Use an approved sample to demonstrate ORCA execution and GPU utilization. Record model/version, outcome and GPU metrics. Application GPUs are supported for ORCA; if ORCA is excluded, omit this step and revisit the application GPU test objective with Chase. Trainer GPU training is a separate use case. [3,7]</w:t>
       </w:r>
     </w:p>
     <w:p>
@@ -2388,7 +2388,7 @@
       <w:pStyle w:val="Footer"/>
     </w:pPr>
     <w:r>
-      <w:t xml:space="preserve">Version 3.0  •  16 October 2026                                      Page </w:t>
+      <w:t xml:space="preserve">Version 3.1  •  16 October 2026                                      Page </w:t>
     </w:r>
     <w:fldSimple w:instr="PAGE"/>
   </w:p>

</xml_diff>